<commit_message>
v1.8.1 - documentation update
</commit_message>
<xml_diff>
--- a/docs/FocusTracer_Teknik_Dokumantasyon_v1.6.docx
+++ b/docs/FocusTracer_Teknik_Dokumantasyon_v1.6.docx
@@ -390,7 +390,7 @@
                 <w:rFonts w:hint="default" w:ascii="Palatino Linotype" w:hAnsi="Palatino Linotype" w:eastAsia="Calibri" w:cs="Palatino Linotype"/>
                 <w:sz w:val="21"/>
                 <w:szCs w:val="22"/>
-                <w:lang w:val="en-US" w:eastAsia="en-US" w:bidi="ar-SA"/>
+                <w:lang w:val="tr-TR" w:eastAsia="en-US" w:bidi="ar-SA"/>
               </w:rPr>
             </w:pPr>
             <w:r>
@@ -398,8 +398,18 @@
                 <w:rFonts w:hint="default" w:ascii="Palatino Linotype" w:hAnsi="Palatino Linotype" w:cs="Palatino Linotype"/>
                 <w:sz w:val="20"/>
               </w:rPr>
-              <w:t>2.2</w:t>
-            </w:r>
+              <w:t>2.</w:t>
+            </w:r>
+            <w:r>
+              <w:rPr>
+                <w:rFonts w:hint="default" w:ascii="Palatino Linotype" w:hAnsi="Palatino Linotype" w:cs="Palatino Linotype"/>
+                <w:sz w:val="20"/>
+                <w:lang w:val="tr-TR"/>
+              </w:rPr>
+              <w:t>3</w:t>
+            </w:r>
+            <w:bookmarkStart w:id="77" w:name="_GoBack"/>
+            <w:bookmarkEnd w:id="77"/>
           </w:p>
         </w:tc>
       </w:tr>
@@ -615,17 +625,7 @@
                 <w:sz w:val="20"/>
                 <w:lang w:val="tr-TR"/>
               </w:rPr>
-              <w:t>30</w:t>
-            </w:r>
-            <w:bookmarkStart w:id="77" w:name="_GoBack"/>
-            <w:bookmarkEnd w:id="77"/>
-            <w:r>
-              <w:rPr>
-                <w:rFonts w:hint="default" w:ascii="Palatino Linotype" w:hAnsi="Palatino Linotype" w:cs="Palatino Linotype"/>
-                <w:sz w:val="20"/>
-                <w:lang w:val="tr-TR"/>
-              </w:rPr>
-              <w:t>.07.</w:t>
+              <w:t>30.07.</w:t>
             </w:r>
             <w:r>
               <w:rPr>
@@ -30836,12 +30836,6 @@
             <w:insideH w:val="single" w:color="auto" w:sz="4" w:space="0"/>
             <w:insideV w:val="single" w:color="auto" w:sz="4" w:space="0"/>
           </w:tblBorders>
-          <w:tblCellMar>
-            <w:top w:w="0" w:type="dxa"/>
-            <w:left w:w="108" w:type="dxa"/>
-            <w:bottom w:w="0" w:type="dxa"/>
-            <w:right w:w="108" w:type="dxa"/>
-          </w:tblCellMar>
         </w:tblPrEx>
         <w:trPr>
           <w:jc w:val="center"/>
@@ -31001,12 +30995,6 @@
             <w:insideH w:val="single" w:color="auto" w:sz="4" w:space="0"/>
             <w:insideV w:val="single" w:color="auto" w:sz="4" w:space="0"/>
           </w:tblBorders>
-          <w:tblCellMar>
-            <w:top w:w="0" w:type="dxa"/>
-            <w:left w:w="108" w:type="dxa"/>
-            <w:bottom w:w="0" w:type="dxa"/>
-            <w:right w:w="108" w:type="dxa"/>
-          </w:tblCellMar>
         </w:tblPrEx>
         <w:trPr>
           <w:jc w:val="center"/>
@@ -31391,6 +31379,12 @@
             <w:insideH w:val="single" w:color="auto" w:sz="4" w:space="0"/>
             <w:insideV w:val="single" w:color="auto" w:sz="4" w:space="0"/>
           </w:tblBorders>
+          <w:tblCellMar>
+            <w:top w:w="0" w:type="dxa"/>
+            <w:left w:w="108" w:type="dxa"/>
+            <w:bottom w:w="0" w:type="dxa"/>
+            <w:right w:w="108" w:type="dxa"/>
+          </w:tblCellMar>
         </w:tblPrEx>
         <w:trPr>
           <w:jc w:val="center"/>
@@ -33311,6 +33305,12 @@
             <w:insideH w:val="single" w:color="auto" w:sz="4" w:space="0"/>
             <w:insideV w:val="single" w:color="auto" w:sz="4" w:space="0"/>
           </w:tblBorders>
+          <w:tblCellMar>
+            <w:top w:w="0" w:type="dxa"/>
+            <w:left w:w="108" w:type="dxa"/>
+            <w:bottom w:w="0" w:type="dxa"/>
+            <w:right w:w="108" w:type="dxa"/>
+          </w:tblCellMar>
         </w:tblPrEx>
         <w:trPr>
           <w:jc w:val="center"/>
@@ -34060,6 +34060,12 @@
             <w:insideH w:val="single" w:color="auto" w:sz="4" w:space="0"/>
             <w:insideV w:val="single" w:color="auto" w:sz="4" w:space="0"/>
           </w:tblBorders>
+          <w:tblCellMar>
+            <w:top w:w="0" w:type="dxa"/>
+            <w:left w:w="108" w:type="dxa"/>
+            <w:bottom w:w="0" w:type="dxa"/>
+            <w:right w:w="108" w:type="dxa"/>
+          </w:tblCellMar>
         </w:tblPrEx>
         <w:trPr>
           <w:jc w:val="center"/>

</xml_diff>